<commit_message>
wip: preserve S1 financial implementation state
</commit_message>
<xml_diff>
--- a/tools/candidates/s1-oplata-za-raboty/03-algoritm-dejstviy.docx
+++ b/tools/candidates/s1-oplata-za-raboty/03-algoritm-dejstviy.docx
@@ -1122,7 +1122,7 @@
           </w:tcPr>
           <w:p>
             <w:r>
-              <w:t>Проверка G пройдена: работы приняты, замечаний нет, срок оплаты истёк. В файле 08, лист «Взаиморасчёты», рассчитан бесспорный долг больше нуля и нет незакрытого флага «ГРАНИЦА»; последний день срока оплаты внесён в файл 02, лист «Маршрут», строка под вопросами (сами вопросы заполнять не обязательно).</w:t>
+              <w:t>Проверка G пройдена: работы приняты, замечаний нет, срок оплаты истёк. В файле 08, лист «Взаиморасчёты», каждая операция отнесена к конкретному акту, колонка «Проверка строки» без «БЛОК», рассчитан текущий бесспорный долг больше нуля и нет незакрытого флага «ГРАНИЦА»; на листе «Долг по актам» у каждого акта указан свой последний день срока оплаты и посчитан долг на первый день просрочки; последний день срока оплаты по самому раннему акту внесён в файл 02, лист «Маршрут», строка под вопросами (сами вопросы заполнять не обязательно).</w:t>
             </w:r>
           </w:p>
         </w:tc>
@@ -1308,7 +1308,7 @@
           </w:tcPr>
           <w:p>
             <w:r>
-              <w:t>В файле 14 на листе «Расчёт» статус «ГОТОВ», а не «ЗАБЛОКИРОВАН»; итог перенесён в претензию.</w:t>
+              <w:t>В файле 14 на листе «Акты» по каждому акту перенесены из файла 08 (лист «Долг по актам») долг на первый день просрочки, дата начала просрочки и текущий остаток для сверки; оплаты после начала просрочки отнесены к актам на листе «Оплаты»; на листе «Расчёт» статус «ГОТОВ», а не «ЗАБЛОКИРОВАН»; итог перенесён в претензию.</w:t>
             </w:r>
           </w:p>
         </w:tc>
@@ -2027,7 +2027,7 @@
           <w:b w:val="0"/>
           <w:i w:val="0"/>
         </w:rPr>
-        <w:t>Подтверждение выполнения: Проверка G пройдена: работы приняты, замечаний нет, срок оплаты истёк. В файле 08, лист «Взаиморасчёты», рассчитан бесспорный долг больше нуля и нет незакрытого флага «ГРАНИЦА»; последний день срока оплаты внесён в файл 02, лист «Маршрут», строка под вопросами (сами вопросы заполнять не обязательно).</w:t>
+        <w:t>Подтверждение выполнения: Проверка G пройдена: работы приняты, замечаний нет, срок оплаты истёк. В файле 08, лист «Взаиморасчёты», каждая операция отнесена к конкретному акту, колонка «Проверка строки» без «БЛОК», рассчитан текущий бесспорный долг больше нуля и нет незакрытого флага «ГРАНИЦА»; на листе «Долг по актам» у каждого акта указан свой последний день срока оплаты и посчитан долг на первый день просрочки; последний день срока оплаты по самому раннему акту внесён в файл 02, лист «Маршрут», строка под вопросами (сами вопросы заполнять не обязательно).</w:t>
       </w:r>
     </w:p>
     <w:p>
@@ -2260,7 +2260,7 @@
           <w:b w:val="0"/>
           <w:i w:val="0"/>
         </w:rPr>
-        <w:t>Подтверждение выполнения: В файле 14 на листе «Расчёт» статус «ГОТОВ», а не «ЗАБЛОКИРОВАН»; итог перенесён в претензию.</w:t>
+        <w:t>Подтверждение выполнения: В файле 14 на листе «Акты» по каждому акту перенесены из файла 08 (лист «Долг по актам») долг на первый день просрочки, дата начала просрочки и текущий остаток для сверки; оплаты после начала просрочки отнесены к актам на листе «Оплаты»; на листе «Расчёт» статус «ГОТОВ», а не «ЗАБЛОКИРОВАН»; итог перенесён в претензию.</w:t>
       </w:r>
     </w:p>
     <w:p>
@@ -2287,6 +2287,22 @@
       </w:pPr>
       <w:r>
         <w:t>Договор устанавливает неустойку за просрочку оплаты — вопрос выбора между неустойкой и процентами (п. 4 ст. 395 ГК РФ) к специалисту.</w:t>
+      </w:r>
+    </w:p>
+    <w:p>
+      <w:pPr>
+        <w:pStyle w:val="ListBullet"/>
+      </w:pPr>
+      <w:r>
+        <w:t>Актов несколько и сроки оплаты по ним разные — каждый акт вводится отдельной строкой со своей датой начала просрочки; объединять их в один долг с одной датой нельзя.</w:t>
+      </w:r>
+    </w:p>
+    <w:p>
+      <w:pPr>
+        <w:pStyle w:val="ListBullet"/>
+      </w:pPr>
+      <w:r>
+        <w:t>Платёж не отнесён к конкретному акту — расчёт заблокирован: распределите платёж документально, очередность зачёта система за вас не назначает.</w:t>
       </w:r>
     </w:p>
     <w:p>
@@ -2667,7 +2683,7 @@
           </w:tcPr>
           <w:p>
             <w:r>
-              <w:t>срок по договору или по двустороннему соглашению</w:t>
+              <w:t>срок по договору или по двустороннему соглашению; по каждому акту свой</w:t>
             </w:r>
           </w:p>
         </w:tc>
@@ -2677,7 +2693,7 @@
           </w:tcPr>
           <w:p>
             <w:r>
-              <w:t>02, лист «Маршрут»</w:t>
+              <w:t>02, лист «Маршрут»; 08, лист «Долг по актам»</w:t>
             </w:r>
           </w:p>
         </w:tc>
@@ -2699,7 +2715,7 @@
           </w:tcPr>
           <w:p>
             <w:r>
-              <w:t>первый день просрочки</w:t>
+              <w:t>первый день просрочки по этому акту</w:t>
             </w:r>
           </w:p>
         </w:tc>
@@ -2709,7 +2725,7 @@
           </w:tcPr>
           <w:p>
             <w:r>
-              <w:t>02; 14, лист «Ввод»</w:t>
+              <w:t>08, «Долг по актам»; 14, лист «Акты»</w:t>
             </w:r>
           </w:p>
         </w:tc>

</xml_diff>

<commit_message>
MB001 #438: atomic correction candidate
</commit_message>
<xml_diff>
--- a/tools/candidates/s1-oplata-za-raboty/03-algoritm-dejstviy.docx
+++ b/tools/candidates/s1-oplata-za-raboty/03-algoritm-dejstviy.docx
@@ -1676,6 +1676,100 @@
       </w:r>
     </w:p>
     <w:p>
+      <w:r>
+        <w:rPr>
+          <w:b w:val="0"/>
+          <w:i w:val="0"/>
+        </w:rPr>
+        <w:t>Уведомление (файл 06) — первое письменное требование после просрочки. Короче претензии; может направляться до неё. Если в письме есть основание, сумма, срок и последствия — суд может оценить его и как претензию, но надёжнее пройти шаг 10.</w:t>
+      </w:r>
+    </w:p>
+    <w:p>
+      <w:r>
+        <w:rPr>
+          <w:b w:val="0"/>
+          <w:i w:val="0"/>
+        </w:rPr>
+        <w:t>Файл 06 — готовое письмо заказчику: в нём только реквизиты сторон, текст, таблица актов, приложение и подпись. Пояснений в письме нет: раздел «Важно, прочитайте до использования» и примечание о редакции-кандидате в начале этого файла относятся и к файлу 06 — прочитайте их до отправки.</w:t>
+      </w:r>
+    </w:p>
+    <w:p>
+      <w:r>
+        <w:rPr>
+          <w:b/>
+          <w:i w:val="0"/>
+        </w:rPr>
+        <w:t>Как заполнить письмо</w:t>
+      </w:r>
+    </w:p>
+    <w:p>
+      <w:pPr>
+        <w:pStyle w:val="ListBullet"/>
+      </w:pPr>
+      <w:r>
+        <w:t>Таблица актов (строки 1–12 файла 06) — по одной строке на акт с листа «Долг по актам» файла 04 (строки 5–34): № и дата акта — колонка C, последний день срока оплаты — колонка D.</w:t>
+      </w:r>
+    </w:p>
+    <w:p>
+      <w:pPr>
+        <w:pStyle w:val="ListBullet"/>
+      </w:pPr>
+      <w:r>
+        <w:t>Замените все поля в двойных фигурных скобках; перед печатью в письме не должно остаться ни одного поля.</w:t>
+      </w:r>
+    </w:p>
+    <w:p>
+      <w:r>
+        <w:rPr>
+          <w:b/>
+          <w:i w:val="0"/>
+        </w:rPr>
+        <w:t>Как подготовить приложение</w:t>
+      </w:r>
+    </w:p>
+    <w:p>
+      <w:r>
+        <w:rPr>
+          <w:b w:val="0"/>
+          <w:i w:val="0"/>
+        </w:rPr>
+        <w:t>Приложение — лист «Взаиморасчёты» файла 04, только заполненные строки. Выделите шапку таблицы (строка 4) и строки с операциями (с 5-й, колонки A–J), затем напечатайте или сохраните в PDF только выделенное: в Calc — «Файл → Экспорт в PDF → Выделение», в Excel — «Печать → Напечатать выделенный фрагмент». Свод справа (колонки L–M) прикладывать не нужно.</w:t>
+      </w:r>
+    </w:p>
+    <w:p>
+      <w:r>
+        <w:rPr>
+          <w:b/>
+          <w:i w:val="0"/>
+        </w:rPr>
+        <w:t>После отправки</w:t>
+      </w:r>
+    </w:p>
+    <w:p>
+      <w:pPr>
+        <w:pStyle w:val="ListBullet"/>
+      </w:pPr>
+      <w:r>
+        <w:t>Направьте способом из файла 07; строка в файле 04, лист «Реестр передачи», с доказательством.</w:t>
+      </w:r>
+    </w:p>
+    <w:p>
+      <w:pPr>
+        <w:pStyle w:val="ListBullet"/>
+      </w:pPr>
+      <w:r>
+        <w:t>Строка в листе «Контроль ответа» (файл 02) со сроком ответа.</w:t>
+      </w:r>
+    </w:p>
+    <w:p>
+      <w:pPr>
+        <w:pStyle w:val="ListBullet"/>
+      </w:pPr>
+      <w:r>
+        <w:t>Звонок контактному лицу; итог — письмом «по итогам разговора фиксируем…».</w:t>
+      </w:r>
+    </w:p>
+    <w:p>
       <w:pPr>
         <w:pStyle w:val="Heading2"/>
       </w:pPr>

</xml_diff>

<commit_message>
MB001 S1: verified native clean court copy route
</commit_message>
<xml_diff>
--- a/tools/candidates/s1-oplata-za-raboty/03-algoritm-dejstviy.docx
+++ b/tools/candidates/s1-oplata-za-raboty/03-algoritm-dejstviy.docx
@@ -2111,6 +2111,15 @@
       </w:r>
     </w:p>
     <w:p>
+      <w:r>
+        <w:rPr>
+          <w:b w:val="0"/>
+          <w:i w:val="0"/>
+        </w:rPr>
+        <w:t>Для направления ответчику и в суд подготовьте отдельную чистую копию искового заявления из файла 10, раздел Б. Сохраните файл 10 под новым именем «Исковое заявление.docx»; в этой копии удалите всё до строки «В Арбитражный суд» и всё после подписи с датой. Удаляется и заголовок «Раздел Б». Сохраните шапку суда, реквизиты сторон, текст и требования, таблицу приложений и подпись. Исходный файл 10 с проверочным листом и описью сохраните для работы. Заполните копию, сохраните её в PDF и проверьте все страницы: в отправляемом документе не должно остаться разделов А, В, Г, инструкций или полей в двойных фигурных скобках.</w:t>
+      </w:r>
+    </w:p>
+    <w:p>
       <w:pPr>
         <w:pStyle w:val="Heading1"/>
       </w:pPr>

</xml_diff>

<commit_message>
S1 01/03: prepare consistent pretrial and interest instructions
</commit_message>
<xml_diff>
--- a/tools/candidates/s1-oplata-za-raboty/03-algoritm-dejstviy.docx
+++ b/tools/candidates/s1-oplata-za-raboty/03-algoritm-dejstviy.docx
@@ -1827,7 +1827,7 @@
         <w:pStyle w:val="ListBullet"/>
       </w:pPr>
       <w:r>
-        <w:t>Договор устанавливает неустойку за просрочку оплаты — вопрос выбора между неустойкой и процентами (п. 4 ст. 395 ГК РФ) к специалисту.</w:t>
+        <w:t>Договор устанавливает неустойку за просрочку оплаты — проценты по общему правилу не взыскиваются, если иное не предусмотрено законом или договором (п. 4 ст. 395 ГК РФ). Применение расчёта процентов — только после оценки специалиста.</w:t>
       </w:r>
     </w:p>
     <w:p>
@@ -2416,7 +2416,7 @@
           </w:tcPr>
           <w:p>
             <w:r>
-              <w:t>Срок из договора, а если его нет — из ч. 5 ст. 4 АПК РФ, со дня направления претензии</w:t>
+              <w:t>Срок из договора или закона, если ими установлен иной срок, а иначе — из ч. 5 ст. 4 АПК РФ, со дня направления претензии</w:t>
             </w:r>
           </w:p>
         </w:tc>

</xml_diff>